<commit_message>
docs: Add literature contribution note and update submission packet with new document references
</commit_message>
<xml_diff>
--- a/docs/SUBMISSION_PACKET_2026-05-16.docx
+++ b/docs/SUBMISSION_PACKET_2026-05-16.docx
@@ -431,6 +431,60 @@
                 <w:rStyle w:val="VerbatimChar"/>
               </w:rPr>
               <w:t xml:space="preserve">docs/STATISTICAL_EVIDENCE_2026-05-17.docx</w:t>
+            </w:r>
+          </w:p>
+        </w:tc>
+      </w:tr>
+      <w:tr>
+        <w:tc>
+          <w:tcPr/>
+          <w:p>
+            <w:pPr>
+              <w:pStyle w:val="Compact"/>
+            </w:pPr>
+            <w:r>
+              <w:t xml:space="preserve">Literature contribution note</w:t>
+            </w:r>
+          </w:p>
+        </w:tc>
+        <w:tc>
+          <w:tcPr/>
+          <w:p>
+            <w:pPr>
+              <w:pStyle w:val="Compact"/>
+            </w:pPr>
+            <w:r>
+              <w:rPr>
+                <w:rStyle w:val="VerbatimChar"/>
+              </w:rPr>
+              <w:t xml:space="preserve">docs/LITERATURE_CONTRIBUTION_2026-05-17.md</w:t>
+            </w:r>
+          </w:p>
+        </w:tc>
+      </w:tr>
+      <w:tr>
+        <w:tc>
+          <w:tcPr/>
+          <w:p>
+            <w:pPr>
+              <w:pStyle w:val="Compact"/>
+            </w:pPr>
+            <w:r>
+              <w:t xml:space="preserve">Literature contribution Word export</w:t>
+            </w:r>
+          </w:p>
+        </w:tc>
+        <w:tc>
+          <w:tcPr/>
+          <w:p>
+            <w:pPr>
+              <w:pStyle w:val="Compact"/>
+            </w:pPr>
+            <w:r>
+              <w:rPr>
+                <w:rStyle w:val="VerbatimChar"/>
+              </w:rPr>
+              <w:t xml:space="preserve">docs/LITERATURE_CONTRIBUTION_2026-05-17.docx</w:t>
             </w:r>
           </w:p>
         </w:tc>

</xml_diff>

<commit_message>
docs: Update CLAUDE.md and README.md with current project status and submission details; add submission readiness checklist
</commit_message>
<xml_diff>
--- a/docs/SUBMISSION_PACKET_2026-05-16.docx
+++ b/docs/SUBMISSION_PACKET_2026-05-16.docx
@@ -485,6 +485,60 @@
                 <w:rStyle w:val="VerbatimChar"/>
               </w:rPr>
               <w:t xml:space="preserve">docs/LITERATURE_CONTRIBUTION_2026-05-17.docx</w:t>
+            </w:r>
+          </w:p>
+        </w:tc>
+      </w:tr>
+      <w:tr>
+        <w:tc>
+          <w:tcPr/>
+          <w:p>
+            <w:pPr>
+              <w:pStyle w:val="Compact"/>
+            </w:pPr>
+            <w:r>
+              <w:t xml:space="preserve">Submission readiness checklist</w:t>
+            </w:r>
+          </w:p>
+        </w:tc>
+        <w:tc>
+          <w:tcPr/>
+          <w:p>
+            <w:pPr>
+              <w:pStyle w:val="Compact"/>
+            </w:pPr>
+            <w:r>
+              <w:rPr>
+                <w:rStyle w:val="VerbatimChar"/>
+              </w:rPr>
+              <w:t xml:space="preserve">docs/SUBMISSION_READINESS_CHECKLIST_2026-05-17.md</w:t>
+            </w:r>
+          </w:p>
+        </w:tc>
+      </w:tr>
+      <w:tr>
+        <w:tc>
+          <w:tcPr/>
+          <w:p>
+            <w:pPr>
+              <w:pStyle w:val="Compact"/>
+            </w:pPr>
+            <w:r>
+              <w:t xml:space="preserve">Submission readiness Word export</w:t>
+            </w:r>
+          </w:p>
+        </w:tc>
+        <w:tc>
+          <w:tcPr/>
+          <w:p>
+            <w:pPr>
+              <w:pStyle w:val="Compact"/>
+            </w:pPr>
+            <w:r>
+              <w:rPr>
+                <w:rStyle w:val="VerbatimChar"/>
+              </w:rPr>
+              <w:t xml:space="preserve">docs/SUBMISSION_READINESS_CHECKLIST_2026-05-17.docx</w:t>
             </w:r>
           </w:p>
         </w:tc>

</xml_diff>

<commit_message>
docs: Update SKILL.md files and add literature review and V8 decision documents; refine workflow and guidelines for literature-backed tasks
</commit_message>
<xml_diff>
--- a/docs/SUBMISSION_PACKET_2026-05-16.docx
+++ b/docs/SUBMISSION_PACKET_2026-05-16.docx
@@ -497,6 +497,114 @@
               <w:pStyle w:val="Compact"/>
             </w:pPr>
             <w:r>
+              <w:t xml:space="preserve">May 2026 literature review</w:t>
+            </w:r>
+          </w:p>
+        </w:tc>
+        <w:tc>
+          <w:tcPr/>
+          <w:p>
+            <w:pPr>
+              <w:pStyle w:val="Compact"/>
+            </w:pPr>
+            <w:r>
+              <w:rPr>
+                <w:rStyle w:val="VerbatimChar"/>
+              </w:rPr>
+              <w:t xml:space="preserve">docs/LITERATURE_REVIEW_2026-05-17.md</w:t>
+            </w:r>
+          </w:p>
+        </w:tc>
+      </w:tr>
+      <w:tr>
+        <w:tc>
+          <w:tcPr/>
+          <w:p>
+            <w:pPr>
+              <w:pStyle w:val="Compact"/>
+            </w:pPr>
+            <w:r>
+              <w:t xml:space="preserve">May 2026 literature review Word export</w:t>
+            </w:r>
+          </w:p>
+        </w:tc>
+        <w:tc>
+          <w:tcPr/>
+          <w:p>
+            <w:pPr>
+              <w:pStyle w:val="Compact"/>
+            </w:pPr>
+            <w:r>
+              <w:rPr>
+                <w:rStyle w:val="VerbatimChar"/>
+              </w:rPr>
+              <w:t xml:space="preserve">docs/LITERATURE_REVIEW_2026-05-17.docx</w:t>
+            </w:r>
+          </w:p>
+        </w:tc>
+      </w:tr>
+      <w:tr>
+        <w:tc>
+          <w:tcPr/>
+          <w:p>
+            <w:pPr>
+              <w:pStyle w:val="Compact"/>
+            </w:pPr>
+            <w:r>
+              <w:t xml:space="preserve">V8 quantum extension decision</w:t>
+            </w:r>
+          </w:p>
+        </w:tc>
+        <w:tc>
+          <w:tcPr/>
+          <w:p>
+            <w:pPr>
+              <w:pStyle w:val="Compact"/>
+            </w:pPr>
+            <w:r>
+              <w:rPr>
+                <w:rStyle w:val="VerbatimChar"/>
+              </w:rPr>
+              <w:t xml:space="preserve">docs/V8_QUANTUM_EXTENSION_DECISION_2026-05-17.md</w:t>
+            </w:r>
+          </w:p>
+        </w:tc>
+      </w:tr>
+      <w:tr>
+        <w:tc>
+          <w:tcPr/>
+          <w:p>
+            <w:pPr>
+              <w:pStyle w:val="Compact"/>
+            </w:pPr>
+            <w:r>
+              <w:t xml:space="preserve">V8 quantum extension decision Word export</w:t>
+            </w:r>
+          </w:p>
+        </w:tc>
+        <w:tc>
+          <w:tcPr/>
+          <w:p>
+            <w:pPr>
+              <w:pStyle w:val="Compact"/>
+            </w:pPr>
+            <w:r>
+              <w:rPr>
+                <w:rStyle w:val="VerbatimChar"/>
+              </w:rPr>
+              <w:t xml:space="preserve">docs/V8_QUANTUM_EXTENSION_DECISION_2026-05-17.docx</w:t>
+            </w:r>
+          </w:p>
+        </w:tc>
+      </w:tr>
+      <w:tr>
+        <w:tc>
+          <w:tcPr/>
+          <w:p>
+            <w:pPr>
+              <w:pStyle w:val="Compact"/>
+            </w:pPr>
+            <w:r>
               <w:t xml:space="preserve">Submission readiness checklist</w:t>
             </w:r>
           </w:p>
@@ -1121,22 +1229,7 @@
         </w:numPr>
       </w:pPr>
       <w:r>
-        <w:t xml:space="preserve">The April 27 clean V7 Drive folder contains checkpoints, but its</w:t>
-      </w:r>
-      <w:r>
-        <w:t xml:space="preserve"> </w:t>
-      </w:r>
-      <w:r>
-        <w:rPr>
-          <w:rStyle w:val="VerbatimChar"/>
-        </w:rPr>
-        <w:t xml:space="preserve">experiments/</w:t>
-      </w:r>
-      <w:r>
-        <w:t xml:space="preserve"> </w:t>
-      </w:r>
-      <w:r>
-        <w:t xml:space="preserve">subfolder is empty because the Colab runtime disconnected before the artifact-copy cell ran.</w:t>
+        <w:t xml:space="preserve">The May 2026 literature review and V8 decision note are planning and claim-safety documents. They do not introduce new benchmark results.</w:t>
       </w:r>
     </w:p>
     <w:p>
@@ -1148,6 +1241,33 @@
         </w:numPr>
       </w:pPr>
       <w:r>
+        <w:t xml:space="preserve">The April 27 clean V7 Drive folder contains checkpoints, but its</w:t>
+      </w:r>
+      <w:r>
+        <w:t xml:space="preserve"> </w:t>
+      </w:r>
+      <w:r>
+        <w:rPr>
+          <w:rStyle w:val="VerbatimChar"/>
+        </w:rPr>
+        <w:t xml:space="preserve">experiments/</w:t>
+      </w:r>
+      <w:r>
+        <w:t xml:space="preserve"> </w:t>
+      </w:r>
+      <w:r>
+        <w:t xml:space="preserve">subfolder is empty because the Colab runtime disconnected before the artifact-copy cell ran.</w:t>
+      </w:r>
+    </w:p>
+    <w:p>
+      <w:pPr>
+        <w:pStyle w:val="Compact"/>
+        <w:numPr>
+          <w:ilvl w:val="0"/>
+          <w:numId w:val="1002"/>
+        </w:numPr>
+      </w:pPr>
+      <w:r>
         <w:t xml:space="preserve">The last user-reported Colab budget before the May 2026 low-data confirmation was approximately</w:t>
       </w:r>
       <w:r>
@@ -1222,6 +1342,18 @@
       </w:pPr>
       <w:r>
         <w:t xml:space="preserve">Do not rerun V7 or low-data rows for artifact hygiene.</w:t>
+      </w:r>
+    </w:p>
+    <w:p>
+      <w:pPr>
+        <w:pStyle w:val="Compact"/>
+        <w:numPr>
+          <w:ilvl w:val="0"/>
+          <w:numId w:val="1003"/>
+        </w:numPr>
+      </w:pPr>
+      <w:r>
+        <w:t xml:space="preserve">Treat V8 as future work until a design note and small gradient/architecture smoke justify training.</w:t>
       </w:r>
     </w:p>
     <w:bookmarkEnd w:id="13"/>

</xml_diff>